<commit_message>
Docx writer: put a heading's bookmark in its paragraph
The bookmark for a section's id surrounded the whole section, at body
level, so a screen reader met it at the section's last line rather than
at the heading. The docx reader looks for bookmarks only inside
paragraphs, so it never read that one back: the heading got an id from
its text, and links to it kept the bookmark's name, which no longer
matches since bookmark names start with an underscore. Now the bookmark
surrounds the heading's text inside the heading's paragraph, as Word
writes one, and links to headings survive a round trip.

Closes #11845. See also #8825.

Co-Authored-By: Claude <noreply@anthropic.com>
</commit_message>
<xml_diff>
--- a/test/docx/golden/block_quotes.docx
+++ b/test/docx/golden/block_quotes.docx
@@ -2,14 +2,15 @@
 <file path=word/document.xml><?xml version="1.0" encoding="utf-8"?>
 <w:document xmlns:w="http://schemas.openxmlformats.org/wordprocessingml/2006/main" xmlns:m="http://schemas.openxmlformats.org/officeDocument/2006/math" xmlns:r="http://schemas.openxmlformats.org/officeDocument/2006/relationships" xmlns:o="urn:schemas-microsoft-com:office:office" xmlns:v="urn:schemas-microsoft-com:vml" xmlns:w10="urn:schemas-microsoft-com:office:word" xmlns:a="http://schemas.openxmlformats.org/drawingml/2006/main" xmlns:pic="http://schemas.openxmlformats.org/drawingml/2006/picture" xmlns:wp="http://schemas.openxmlformats.org/drawingml/2006/wordprocessingDrawing">
   <w:body>
-    <w:bookmarkStart w:id="9" w:name="_418802410d838908ba1f61f58c4f20351b8354c"/>
     <w:p>
       <w:pPr>
         <w:pStyle w:val="Heading2"/>
       </w:pPr>
+      <w:bookmarkStart w:id="9" w:name="_418802410d838908ba1f61f58c4f20351b8354c"/>
       <w:r>
         <w:t xml:space="preserve">Some block quotes, in different ways</w:t>
       </w:r>
+      <w:bookmarkEnd w:id="9"/>
     </w:p>
     <w:p>
       <w:pPr>
@@ -67,7 +68,6 @@
         <w:t xml:space="preserve">And back to the normal style.</w:t>
       </w:r>
     </w:p>
-    <w:bookmarkEnd w:id="9"/>
     <w:sectPr>
       <w:footnotePr>
         <w:numRestart w:val="eachSect"/>

</xml_diff>

<commit_message>
reference.docx: don't make Table style semiHidden.
If it is semiHidden, it doesn't appear in the table styles
gallery.

Closes #11931.
</commit_message>
<xml_diff>
--- a/test/docx/golden/block_quotes.docx
+++ b/test/docx/golden/block_quotes.docx
@@ -189,10 +189,10 @@
   <w:docDefaults>
     <w:rPrDefault>
       <w:rPr>
-        <w:rFonts w:asciiTheme="minorHAnsi" w:cstheme="minorBidi" w:eastAsiaTheme="minorEastAsia" w:hAnsiTheme="minorHAnsi"/>
+        <w:rFonts w:asciiTheme="minorHAnsi" w:eastAsiaTheme="minorEastAsia" w:hAnsiTheme="minorHAnsi" w:cstheme="minorBidi"/>
         <w:sz w:val="24"/>
         <w:szCs w:val="24"/>
-        <w:lang w:bidi="ar-SA" w:eastAsia="zh-CN" w:val="en-US"/>
+        <w:lang w:val="en-US" w:eastAsia="zh-CN" w:bidi="ar-SA"/>
       </w:rPr>
     </w:rPrDefault>
     <w:pPrDefault>
@@ -201,35 +201,35 @@
       </w:pPr>
     </w:pPrDefault>
   </w:docDefaults>
-  <w:latentStyles w:count="276" w:defLockedState="0" w:defQFormat="0" w:defSemiHidden="0" w:defUIPriority="0" w:defUnhideWhenUsed="0"/>
-  <w:style w:default="1" w:styleId="Normal" w:type="paragraph">
+  <w:latentStyles w:defLockedState="0" w:defUIPriority="0" w:defSemiHidden="0" w:defUnhideWhenUsed="0" w:defQFormat="0" w:count="276"/>
+  <w:style w:type="paragraph" w:default="1" w:styleId="Normal">
     <w:name w:val="Normal"/>
     <w:qFormat/>
   </w:style>
-  <w:style w:styleId="BodyText" w:type="paragraph">
+  <w:style w:type="paragraph" w:styleId="BodyText">
     <w:name w:val="Body Text"/>
     <w:basedOn w:val="Normal"/>
     <w:link w:val="BodyTextChar"/>
     <w:qFormat/>
     <w:pPr>
-      <w:spacing w:after="180" w:before="180"/>
-    </w:pPr>
-  </w:style>
-  <w:style w:customStyle="1" w:styleId="FirstParagraph" w:type="paragraph">
+      <w:spacing w:before="180" w:after="180"/>
+    </w:pPr>
+  </w:style>
+  <w:style w:type="paragraph" w:customStyle="1" w:styleId="FirstParagraph">
     <w:name w:val="First Paragraph"/>
     <w:basedOn w:val="BodyText"/>
     <w:next w:val="BodyText"/>
     <w:qFormat/>
   </w:style>
-  <w:style w:customStyle="1" w:styleId="Compact" w:type="paragraph">
+  <w:style w:type="paragraph" w:customStyle="1" w:styleId="Compact">
     <w:name w:val="Compact"/>
     <w:basedOn w:val="BodyText"/>
     <w:qFormat/>
     <w:pPr>
-      <w:spacing w:after="36" w:before="36"/>
-    </w:pPr>
-  </w:style>
-  <w:style w:styleId="Title" w:type="paragraph">
+      <w:spacing w:before="36" w:after="36"/>
+    </w:pPr>
+  </w:style>
+  <w:style w:type="paragraph" w:styleId="Title">
     <w:name w:val="Title"/>
     <w:basedOn w:val="Normal"/>
     <w:next w:val="BodyText"/>
@@ -243,24 +243,24 @@
       <w:jc w:val="center"/>
     </w:pPr>
     <w:rPr>
-      <w:rFonts w:asciiTheme="majorHAnsi" w:cstheme="majorBidi" w:eastAsiaTheme="majorEastAsia" w:hAnsiTheme="majorHAnsi"/>
+      <w:rFonts w:asciiTheme="majorHAnsi" w:eastAsiaTheme="majorEastAsia" w:hAnsiTheme="majorHAnsi" w:cstheme="majorBidi"/>
       <w:sz w:val="56"/>
       <w:szCs w:val="56"/>
     </w:rPr>
   </w:style>
-  <w:style w:customStyle="1" w:styleId="TitleChar" w:type="character">
+  <w:style w:type="character" w:customStyle="1" w:styleId="TitleChar">
     <w:name w:val="Title Char"/>
     <w:basedOn w:val="DefaultParagraphFont"/>
     <w:link w:val="Title"/>
     <w:uiPriority w:val="10"/>
     <w:rsid w:val="00A10FD9"/>
     <w:rPr>
-      <w:rFonts w:asciiTheme="majorHAnsi" w:cstheme="majorBidi" w:eastAsiaTheme="majorEastAsia" w:hAnsiTheme="majorHAnsi"/>
+      <w:rFonts w:asciiTheme="majorHAnsi" w:eastAsiaTheme="majorEastAsia" w:hAnsiTheme="majorHAnsi" w:cstheme="majorBidi"/>
       <w:sz w:val="56"/>
       <w:szCs w:val="56"/>
     </w:rPr>
   </w:style>
-  <w:style w:styleId="Subtitle" w:type="paragraph">
+  <w:style w:type="paragraph" w:styleId="Subtitle">
     <w:name w:val="Subtitle"/>
     <w:basedOn w:val="Title"/>
     <w:next w:val="BodyText"/>
@@ -274,27 +274,27 @@
       </w:numPr>
     </w:pPr>
     <w:rPr>
-      <w:rFonts w:cstheme="majorBidi" w:eastAsiaTheme="majorEastAsia"/>
+      <w:rFonts w:eastAsiaTheme="majorEastAsia" w:cstheme="majorBidi"/>
       <w:spacing w:val="15"/>
       <w:sz w:val="28"/>
       <w:szCs w:val="28"/>
     </w:rPr>
   </w:style>
-  <w:style w:customStyle="1" w:styleId="SubtitleChar" w:type="character">
+  <w:style w:type="character" w:customStyle="1" w:styleId="SubtitleChar">
     <w:name w:val="Subtitle Char"/>
     <w:basedOn w:val="DefaultParagraphFont"/>
     <w:link w:val="Subtitle"/>
     <w:uiPriority w:val="11"/>
     <w:rsid w:val="00A10FD9"/>
     <w:rPr>
-      <w:rFonts w:cstheme="majorBidi" w:eastAsiaTheme="majorEastAsia"/>
-      <w:color w:themeColor="text1" w:themeTint="A6" w:val="595959"/>
+      <w:rFonts w:eastAsiaTheme="majorEastAsia" w:cstheme="majorBidi"/>
+      <w:color w:val="595959" w:themeColor="text1" w:themeTint="A6"/>
       <w:spacing w:val="15"/>
       <w:sz w:val="28"/>
       <w:szCs w:val="28"/>
     </w:rPr>
   </w:style>
-  <w:style w:customStyle="1" w:styleId="Author" w:type="paragraph">
+  <w:style w:type="paragraph" w:customStyle="1" w:styleId="Author">
     <w:name w:val="Author"/>
     <w:basedOn w:val="Title"/>
     <w:next w:val="BodyText"/>
@@ -308,7 +308,7 @@
       <w:szCs w:val="24"/>
     </w:rPr>
   </w:style>
-  <w:style w:styleId="Date" w:type="paragraph">
+  <w:style w:type="paragraph" w:styleId="Date">
     <w:name w:val="Date"/>
     <w:basedOn w:val="Title"/>
     <w:next w:val="BodyText"/>
@@ -322,7 +322,7 @@
       <w:szCs w:val="24"/>
     </w:rPr>
   </w:style>
-  <w:style w:customStyle="1" w:styleId="AbstractTitle" w:type="paragraph">
+  <w:style w:type="paragraph" w:customStyle="1" w:styleId="AbstractTitle">
     <w:name w:val="Abstract Title"/>
     <w:basedOn w:val="Normal"/>
     <w:next w:val="Abstract"/>
@@ -330,7 +330,7 @@
     <w:pPr>
       <w:keepNext/>
       <w:keepLines/>
-      <w:spacing w:after="0" w:before="300"/>
+      <w:spacing w:before="300" w:after="0"/>
       <w:jc w:val="center"/>
     </w:pPr>
     <w:rPr>
@@ -339,7 +339,7 @@
       <w:szCs w:val="20"/>
     </w:rPr>
   </w:style>
-  <w:style w:customStyle="1" w:styleId="Abstract" w:type="paragraph">
+  <w:style w:type="paragraph" w:customStyle="1" w:styleId="Abstract">
     <w:name w:val="Abstract"/>
     <w:basedOn w:val="Normal"/>
     <w:next w:val="BodyText"/>
@@ -347,14 +347,14 @@
     <w:pPr>
       <w:keepNext/>
       <w:keepLines/>
-      <w:spacing w:after="300" w:before="100"/>
+      <w:spacing w:before="100" w:after="300"/>
     </w:pPr>
     <w:rPr>
       <w:sz w:val="20"/>
       <w:szCs w:val="20"/>
     </w:rPr>
   </w:style>
-  <w:style w:styleId="Bibliography" w:type="paragraph">
+  <w:style w:type="paragraph" w:styleId="Bibliography">
     <w:name w:val="Bibliography"/>
     <w:basedOn w:val="Normal"/>
     <w:next w:val="Bibliography"/>
@@ -362,7 +362,7 @@
     <w:pPr/>
     <w:rPr/>
   </w:style>
-  <w:style w:styleId="Heading1" w:type="paragraph">
+  <w:style w:type="paragraph" w:styleId="Heading1">
     <w:name w:val="heading 1"/>
     <w:basedOn w:val="Normal"/>
     <w:next w:val="BodyText"/>
@@ -373,17 +373,17 @@
     <w:pPr>
       <w:keepNext/>
       <w:keepLines/>
-      <w:spacing w:after="80" w:before="360"/>
+      <w:spacing w:before="360" w:after="80"/>
       <w:outlineLvl w:val="0"/>
     </w:pPr>
     <w:rPr>
-      <w:rFonts w:asciiTheme="majorHAnsi" w:cstheme="majorBidi" w:eastAsiaTheme="majorEastAsia" w:hAnsiTheme="majorHAnsi"/>
-      <w:color w:themeColor="accent1" w:themeShade="BF" w:val="0F4761"/>
+      <w:rFonts w:asciiTheme="majorHAnsi" w:eastAsiaTheme="majorEastAsia" w:hAnsiTheme="majorHAnsi" w:cstheme="majorBidi"/>
+      <w:color w:val="0F4761" w:themeColor="accent1" w:themeShade="BF"/>
       <w:sz w:val="40"/>
       <w:szCs w:val="40"/>
     </w:rPr>
   </w:style>
-  <w:style w:styleId="Heading2" w:type="paragraph">
+  <w:style w:type="paragraph" w:styleId="Heading2">
     <w:name w:val="heading 2"/>
     <w:basedOn w:val="Normal"/>
     <w:next w:val="BodyText"/>
@@ -396,17 +396,17 @@
     <w:pPr>
       <w:keepNext/>
       <w:keepLines/>
-      <w:spacing w:after="80" w:before="160"/>
+      <w:spacing w:before="160" w:after="80"/>
       <w:outlineLvl w:val="1"/>
     </w:pPr>
     <w:rPr>
-      <w:rFonts w:asciiTheme="majorHAnsi" w:cstheme="majorBidi" w:eastAsiaTheme="majorEastAsia" w:hAnsiTheme="majorHAnsi"/>
-      <w:color w:themeColor="accent1" w:themeShade="BF" w:val="0F4761"/>
+      <w:rFonts w:asciiTheme="majorHAnsi" w:eastAsiaTheme="majorEastAsia" w:hAnsiTheme="majorHAnsi" w:cstheme="majorBidi"/>
+      <w:color w:val="0F4761" w:themeColor="accent1" w:themeShade="BF"/>
       <w:sz w:val="32"/>
       <w:szCs w:val="32"/>
     </w:rPr>
   </w:style>
-  <w:style w:styleId="Heading3" w:type="paragraph">
+  <w:style w:type="paragraph" w:styleId="Heading3">
     <w:name w:val="heading 3"/>
     <w:basedOn w:val="Normal"/>
     <w:next w:val="BodyText"/>
@@ -419,17 +419,17 @@
     <w:pPr>
       <w:keepNext/>
       <w:keepLines/>
-      <w:spacing w:after="80" w:before="160"/>
+      <w:spacing w:before="160" w:after="80"/>
       <w:outlineLvl w:val="2"/>
     </w:pPr>
     <w:rPr>
-      <w:rFonts w:cstheme="majorBidi" w:eastAsiaTheme="majorEastAsia"/>
-      <w:color w:themeColor="accent1" w:themeShade="BF" w:val="0F4761"/>
+      <w:rFonts w:eastAsiaTheme="majorEastAsia" w:cstheme="majorBidi"/>
+      <w:color w:val="0F4761" w:themeColor="accent1" w:themeShade="BF"/>
       <w:sz w:val="28"/>
       <w:szCs w:val="28"/>
     </w:rPr>
   </w:style>
-  <w:style w:styleId="Heading4" w:type="paragraph">
+  <w:style w:type="paragraph" w:styleId="Heading4">
     <w:name w:val="heading 4"/>
     <w:basedOn w:val="Normal"/>
     <w:next w:val="BodyText"/>
@@ -442,17 +442,17 @@
     <w:pPr>
       <w:keepNext/>
       <w:keepLines/>
-      <w:spacing w:after="40" w:before="80"/>
+      <w:spacing w:before="80" w:after="40"/>
       <w:outlineLvl w:val="3"/>
     </w:pPr>
     <w:rPr>
-      <w:rFonts w:cstheme="majorBidi" w:eastAsiaTheme="majorEastAsia"/>
+      <w:rFonts w:eastAsiaTheme="majorEastAsia" w:cstheme="majorBidi"/>
       <w:i/>
       <w:iCs/>
-      <w:color w:themeColor="accent1" w:themeShade="BF" w:val="0F4761"/>
-    </w:rPr>
-  </w:style>
-  <w:style w:styleId="Heading5" w:type="paragraph">
+      <w:color w:val="0F4761" w:themeColor="accent1" w:themeShade="BF"/>
+    </w:rPr>
+  </w:style>
+  <w:style w:type="paragraph" w:styleId="Heading5">
     <w:name w:val="heading 5"/>
     <w:basedOn w:val="Normal"/>
     <w:next w:val="BodyText"/>
@@ -465,15 +465,15 @@
     <w:pPr>
       <w:keepNext/>
       <w:keepLines/>
-      <w:spacing w:after="40" w:before="80"/>
+      <w:spacing w:before="80" w:after="40"/>
       <w:outlineLvl w:val="4"/>
     </w:pPr>
     <w:rPr>
-      <w:rFonts w:cstheme="majorBidi" w:eastAsiaTheme="majorEastAsia"/>
-      <w:color w:themeColor="accent1" w:themeShade="BF" w:val="0F4761"/>
-    </w:rPr>
-  </w:style>
-  <w:style w:styleId="Heading6" w:type="paragraph">
+      <w:rFonts w:eastAsiaTheme="majorEastAsia" w:cstheme="majorBidi"/>
+      <w:color w:val="0F4761" w:themeColor="accent1" w:themeShade="BF"/>
+    </w:rPr>
+  </w:style>
+  <w:style w:type="paragraph" w:styleId="Heading6">
     <w:name w:val="heading 6"/>
     <w:basedOn w:val="Normal"/>
     <w:next w:val="BodyText"/>
@@ -486,17 +486,17 @@
     <w:pPr>
       <w:keepNext/>
       <w:keepLines/>
-      <w:spacing w:after="0" w:before="40"/>
+      <w:spacing w:before="40" w:after="0"/>
       <w:outlineLvl w:val="5"/>
     </w:pPr>
     <w:rPr>
-      <w:rFonts w:cstheme="majorBidi" w:eastAsiaTheme="majorEastAsia"/>
+      <w:rFonts w:eastAsiaTheme="majorEastAsia" w:cstheme="majorBidi"/>
       <w:i/>
       <w:iCs/>
-      <w:color w:themeColor="text1" w:themeTint="A6" w:val="595959"/>
-    </w:rPr>
-  </w:style>
-  <w:style w:styleId="Heading7" w:type="paragraph">
+      <w:color w:val="595959" w:themeColor="text1" w:themeTint="A6"/>
+    </w:rPr>
+  </w:style>
+  <w:style w:type="paragraph" w:styleId="Heading7">
     <w:name w:val="heading 7"/>
     <w:basedOn w:val="Normal"/>
     <w:next w:val="BodyText"/>
@@ -509,15 +509,15 @@
     <w:pPr>
       <w:keepNext/>
       <w:keepLines/>
-      <w:spacing w:after="0" w:before="40"/>
+      <w:spacing w:before="40" w:after="0"/>
       <w:outlineLvl w:val="6"/>
     </w:pPr>
     <w:rPr>
-      <w:rFonts w:cstheme="majorBidi" w:eastAsiaTheme="majorEastAsia"/>
-      <w:color w:themeColor="text1" w:themeTint="A6" w:val="595959"/>
-    </w:rPr>
-  </w:style>
-  <w:style w:styleId="Heading8" w:type="paragraph">
+      <w:rFonts w:eastAsiaTheme="majorEastAsia" w:cstheme="majorBidi"/>
+      <w:color w:val="595959" w:themeColor="text1" w:themeTint="A6"/>
+    </w:rPr>
+  </w:style>
+  <w:style w:type="paragraph" w:styleId="Heading8">
     <w:name w:val="heading 8"/>
     <w:basedOn w:val="Normal"/>
     <w:next w:val="BodyText"/>
@@ -534,13 +534,13 @@
       <w:outlineLvl w:val="7"/>
     </w:pPr>
     <w:rPr>
-      <w:rFonts w:cstheme="majorBidi" w:eastAsiaTheme="majorEastAsia"/>
+      <w:rFonts w:eastAsiaTheme="majorEastAsia" w:cstheme="majorBidi"/>
       <w:i/>
       <w:iCs/>
-      <w:color w:themeColor="text1" w:themeTint="D8" w:val="272727"/>
-    </w:rPr>
-  </w:style>
-  <w:style w:styleId="Heading9" w:type="paragraph">
+      <w:color w:val="272727" w:themeColor="text1" w:themeTint="D8"/>
+    </w:rPr>
+  </w:style>
+  <w:style w:type="paragraph" w:styleId="Heading9">
     <w:name w:val="heading 9"/>
     <w:basedOn w:val="Normal"/>
     <w:next w:val="BodyText"/>
@@ -557,24 +557,24 @@
       <w:outlineLvl w:val="8"/>
     </w:pPr>
     <w:rPr>
-      <w:rFonts w:cstheme="majorBidi" w:eastAsiaTheme="majorEastAsia"/>
-      <w:color w:themeColor="text1" w:themeTint="D8" w:val="272727"/>
-    </w:rPr>
-  </w:style>
-  <w:style w:customStyle="1" w:styleId="Heading1Char" w:type="character">
+      <w:rFonts w:eastAsiaTheme="majorEastAsia" w:cstheme="majorBidi"/>
+      <w:color w:val="272727" w:themeColor="text1" w:themeTint="D8"/>
+    </w:rPr>
+  </w:style>
+  <w:style w:type="character" w:customStyle="1" w:styleId="Heading1Char">
     <w:name w:val="Heading 1 Char"/>
     <w:basedOn w:val="DefaultParagraphFont"/>
     <w:link w:val="Heading1"/>
     <w:uiPriority w:val="9"/>
     <w:rsid w:val="00A10FD9"/>
     <w:rPr>
-      <w:rFonts w:asciiTheme="majorHAnsi" w:cstheme="majorBidi" w:eastAsiaTheme="majorEastAsia" w:hAnsiTheme="majorHAnsi"/>
-      <w:color w:themeColor="accent1" w:themeShade="BF" w:val="0F4761"/>
+      <w:rFonts w:asciiTheme="majorHAnsi" w:eastAsiaTheme="majorEastAsia" w:hAnsiTheme="majorHAnsi" w:cstheme="majorBidi"/>
+      <w:color w:val="0F4761" w:themeColor="accent1" w:themeShade="BF"/>
       <w:sz w:val="40"/>
       <w:szCs w:val="40"/>
     </w:rPr>
   </w:style>
-  <w:style w:customStyle="1" w:styleId="Heading2Char" w:type="character">
+  <w:style w:type="character" w:customStyle="1" w:styleId="Heading2Char">
     <w:name w:val="Heading 2 Char"/>
     <w:basedOn w:val="DefaultParagraphFont"/>
     <w:link w:val="Heading2"/>
@@ -582,13 +582,13 @@
     <w:semiHidden/>
     <w:rsid w:val="00A10FD9"/>
     <w:rPr>
-      <w:rFonts w:asciiTheme="majorHAnsi" w:cstheme="majorBidi" w:eastAsiaTheme="majorEastAsia" w:hAnsiTheme="majorHAnsi"/>
-      <w:color w:themeColor="accent1" w:themeShade="BF" w:val="0F4761"/>
+      <w:rFonts w:asciiTheme="majorHAnsi" w:eastAsiaTheme="majorEastAsia" w:hAnsiTheme="majorHAnsi" w:cstheme="majorBidi"/>
+      <w:color w:val="0F4761" w:themeColor="accent1" w:themeShade="BF"/>
       <w:sz w:val="32"/>
       <w:szCs w:val="32"/>
     </w:rPr>
   </w:style>
-  <w:style w:customStyle="1" w:styleId="Heading3Char" w:type="character">
+  <w:style w:type="character" w:customStyle="1" w:styleId="Heading3Char">
     <w:name w:val="Heading 3 Char"/>
     <w:basedOn w:val="DefaultParagraphFont"/>
     <w:link w:val="Heading3"/>
@@ -596,13 +596,13 @@
     <w:semiHidden/>
     <w:rsid w:val="00A10FD9"/>
     <w:rPr>
-      <w:rFonts w:cstheme="majorBidi" w:eastAsiaTheme="majorEastAsia"/>
-      <w:color w:themeColor="accent1" w:themeShade="BF" w:val="0F4761"/>
+      <w:rFonts w:eastAsiaTheme="majorEastAsia" w:cstheme="majorBidi"/>
+      <w:color w:val="0F4761" w:themeColor="accent1" w:themeShade="BF"/>
       <w:sz w:val="28"/>
       <w:szCs w:val="28"/>
     </w:rPr>
   </w:style>
-  <w:style w:customStyle="1" w:styleId="Heading4Char" w:type="character">
+  <w:style w:type="character" w:customStyle="1" w:styleId="Heading4Char">
     <w:name w:val="Heading 4 Char"/>
     <w:basedOn w:val="DefaultParagraphFont"/>
     <w:link w:val="Heading4"/>
@@ -610,13 +610,13 @@
     <w:semiHidden/>
     <w:rsid w:val="00A10FD9"/>
     <w:rPr>
-      <w:rFonts w:cstheme="majorBidi" w:eastAsiaTheme="majorEastAsia"/>
+      <w:rFonts w:eastAsiaTheme="majorEastAsia" w:cstheme="majorBidi"/>
       <w:i/>
       <w:iCs/>
-      <w:color w:themeColor="accent1" w:themeShade="BF" w:val="0F4761"/>
-    </w:rPr>
-  </w:style>
-  <w:style w:customStyle="1" w:styleId="Heading5Char" w:type="character">
+      <w:color w:val="0F4761" w:themeColor="accent1" w:themeShade="BF"/>
+    </w:rPr>
+  </w:style>
+  <w:style w:type="character" w:customStyle="1" w:styleId="Heading5Char">
     <w:name w:val="Heading 5 Char"/>
     <w:basedOn w:val="DefaultParagraphFont"/>
     <w:link w:val="Heading5"/>
@@ -624,11 +624,11 @@
     <w:semiHidden/>
     <w:rsid w:val="00A10FD9"/>
     <w:rPr>
-      <w:rFonts w:cstheme="majorBidi" w:eastAsiaTheme="majorEastAsia"/>
-      <w:color w:themeColor="accent1" w:themeShade="BF" w:val="0F4761"/>
-    </w:rPr>
-  </w:style>
-  <w:style w:customStyle="1" w:styleId="Heading6Char" w:type="character">
+      <w:rFonts w:eastAsiaTheme="majorEastAsia" w:cstheme="majorBidi"/>
+      <w:color w:val="0F4761" w:themeColor="accent1" w:themeShade="BF"/>
+    </w:rPr>
+  </w:style>
+  <w:style w:type="character" w:customStyle="1" w:styleId="Heading6Char">
     <w:name w:val="Heading 6 Char"/>
     <w:basedOn w:val="DefaultParagraphFont"/>
     <w:link w:val="Heading6"/>
@@ -636,13 +636,13 @@
     <w:semiHidden/>
     <w:rsid w:val="00A10FD9"/>
     <w:rPr>
-      <w:rFonts w:cstheme="majorBidi" w:eastAsiaTheme="majorEastAsia"/>
+      <w:rFonts w:eastAsiaTheme="majorEastAsia" w:cstheme="majorBidi"/>
       <w:i/>
       <w:iCs/>
-      <w:color w:themeColor="text1" w:themeTint="A6" w:val="595959"/>
-    </w:rPr>
-  </w:style>
-  <w:style w:customStyle="1" w:styleId="Heading7Char" w:type="character">
+      <w:color w:val="595959" w:themeColor="text1" w:themeTint="A6"/>
+    </w:rPr>
+  </w:style>
+  <w:style w:type="character" w:customStyle="1" w:styleId="Heading7Char">
     <w:name w:val="Heading 7 Char"/>
     <w:basedOn w:val="DefaultParagraphFont"/>
     <w:link w:val="Heading7"/>
@@ -650,11 +650,11 @@
     <w:semiHidden/>
     <w:rsid w:val="00A10FD9"/>
     <w:rPr>
-      <w:rFonts w:cstheme="majorBidi" w:eastAsiaTheme="majorEastAsia"/>
-      <w:color w:themeColor="text1" w:themeTint="A6" w:val="595959"/>
-    </w:rPr>
-  </w:style>
-  <w:style w:customStyle="1" w:styleId="Heading8Char" w:type="character">
+      <w:rFonts w:eastAsiaTheme="majorEastAsia" w:cstheme="majorBidi"/>
+      <w:color w:val="595959" w:themeColor="text1" w:themeTint="A6"/>
+    </w:rPr>
+  </w:style>
+  <w:style w:type="character" w:customStyle="1" w:styleId="Heading8Char">
     <w:name w:val="Heading 8 Char"/>
     <w:basedOn w:val="DefaultParagraphFont"/>
     <w:link w:val="Heading8"/>
@@ -662,13 +662,13 @@
     <w:semiHidden/>
     <w:rsid w:val="00A10FD9"/>
     <w:rPr>
-      <w:rFonts w:cstheme="majorBidi" w:eastAsiaTheme="majorEastAsia"/>
+      <w:rFonts w:eastAsiaTheme="majorEastAsia" w:cstheme="majorBidi"/>
       <w:i/>
       <w:iCs/>
-      <w:color w:themeColor="text1" w:themeTint="D8" w:val="272727"/>
-    </w:rPr>
-  </w:style>
-  <w:style w:customStyle="1" w:styleId="Heading9Char" w:type="character">
+      <w:color w:val="272727" w:themeColor="text1" w:themeTint="D8"/>
+    </w:rPr>
+  </w:style>
+  <w:style w:type="character" w:customStyle="1" w:styleId="Heading9Char">
     <w:name w:val="Heading 9 Char"/>
     <w:basedOn w:val="DefaultParagraphFont"/>
     <w:link w:val="Heading9"/>
@@ -676,11 +676,11 @@
     <w:semiHidden/>
     <w:rsid w:val="00A10FD9"/>
     <w:rPr>
-      <w:rFonts w:cstheme="majorBidi" w:eastAsiaTheme="majorEastAsia"/>
-      <w:color w:themeColor="text1" w:themeTint="D8" w:val="272727"/>
-    </w:rPr>
-  </w:style>
-  <w:style w:styleId="BlockText" w:type="paragraph">
+      <w:rFonts w:eastAsiaTheme="majorEastAsia" w:cstheme="majorBidi"/>
+      <w:color w:val="272727" w:themeColor="text1" w:themeTint="D8"/>
+    </w:rPr>
+  </w:style>
+  <w:style w:type="paragraph" w:styleId="BlockText">
     <w:name w:val="Block Text"/>
     <w:basedOn w:val="BodyText"/>
     <w:next w:val="BodyText"/>
@@ -688,11 +688,11 @@
     <w:unhideWhenUsed/>
     <w:qFormat/>
     <w:pPr>
-      <w:spacing w:after="100" w:before="100"/>
+      <w:spacing w:before="100" w:after="100"/>
       <w:ind w:firstLine="0" w:left="480" w:right="480"/>
     </w:pPr>
   </w:style>
-  <w:style w:styleId="FootnoteText" w:type="paragraph">
+  <w:style w:type="paragraph" w:styleId="FootnoteText">
     <w:name w:val="Footnote Text"/>
     <w:basedOn w:val="Normal"/>
     <w:next w:val="FootnoteText"/>
@@ -700,7 +700,7 @@
     <w:unhideWhenUsed/>
     <w:qFormat/>
   </w:style>
-  <w:style w:styleId="FootnoteBlockText" w:type="paragraph">
+  <w:style w:type="paragraph" w:styleId="FootnoteBlockText">
     <w:name w:val="Footnote Block Text"/>
     <w:basedOn w:val="FootnoteText"/>
     <w:next w:val="FootnoteText"/>
@@ -708,28 +708,26 @@
     <w:unhideWhenUsed/>
     <w:qFormat/>
     <w:pPr>
-      <w:spacing w:after="100" w:before="100"/>
+      <w:spacing w:before="100" w:after="100"/>
       <w:ind w:firstLine="0" w:left="480" w:right="480"/>
     </w:pPr>
   </w:style>
-  <w:style w:default="1" w:styleId="DefaultParagraphFont" w:type="character">
+  <w:style w:type="character" w:default="1" w:styleId="DefaultParagraphFont">
     <w:name w:val="Default Paragraph Font"/>
     <w:semiHidden/>
     <w:unhideWhenUsed/>
   </w:style>
-  <w:style w:default="1" w:styleId="Table" w:type="table">
+  <w:style w:type="table" w:default="1" w:styleId="Table">
     <w:name w:val="Table"/>
     <w:basedOn w:val="TableNormal"/>
-    <w:semiHidden/>
-    <w:unhideWhenUsed/>
     <w:qFormat/>
     <w:tblPr>
-      <w:tblInd w:type="dxa" w:w="0"/>
+      <w:tblInd w:w="0" w:type="dxa"/>
       <w:tblCellMar>
-        <w:top w:type="dxa" w:w="0"/>
-        <w:left w:type="dxa" w:w="108"/>
-        <w:bottom w:type="dxa" w:w="0"/>
-        <w:right w:type="dxa" w:w="108"/>
+        <w:top w:w="0" w:type="dxa"/>
+        <w:left w:w="108" w:type="dxa"/>
+        <w:bottom w:w="0" w:type="dxa"/>
+        <w:right w:w="108" w:type="dxa"/>
       </w:tblCellMar>
     </w:tblPr>
     <w:tblStylePr w:type="firstRow">
@@ -741,7 +739,7 @@
       </w:tcPr>
     </w:tblStylePr>
   </w:style>
-  <w:style w:customStyle="1" w:styleId="DefinitionTerm" w:type="paragraph">
+  <w:style w:type="paragraph" w:customStyle="1" w:styleId="DefinitionTerm">
     <w:name w:val="Definition Term"/>
     <w:basedOn w:val="Normal"/>
     <w:next w:val="Definition"/>
@@ -754,49 +752,49 @@
       <w:b/>
     </w:rPr>
   </w:style>
-  <w:style w:customStyle="1" w:styleId="Definition" w:type="paragraph">
+  <w:style w:type="paragraph" w:customStyle="1" w:styleId="Definition">
     <w:name w:val="Definition"/>
     <w:basedOn w:val="Normal"/>
   </w:style>
-  <w:style w:styleId="Caption" w:type="paragraph">
+  <w:style w:type="paragraph" w:styleId="Caption">
     <w:name w:val="Caption"/>
     <w:basedOn w:val="Normal"/>
     <w:link w:val="BodyTextChar"/>
     <w:pPr>
-      <w:spacing w:after="120" w:before="0"/>
+      <w:spacing w:before="0" w:after="120"/>
     </w:pPr>
     <w:rPr>
       <w:i/>
     </w:rPr>
   </w:style>
-  <w:style w:customStyle="1" w:styleId="TableCaption" w:type="paragraph">
+  <w:style w:type="paragraph" w:customStyle="1" w:styleId="TableCaption">
     <w:name w:val="Table Caption"/>
     <w:basedOn w:val="Caption"/>
     <w:pPr>
       <w:keepNext/>
     </w:pPr>
   </w:style>
-  <w:style w:customStyle="1" w:styleId="ImageCaption" w:type="paragraph">
+  <w:style w:type="paragraph" w:customStyle="1" w:styleId="ImageCaption">
     <w:name w:val="Image Caption"/>
     <w:basedOn w:val="Caption"/>
   </w:style>
-  <w:style w:customStyle="1" w:styleId="Figure" w:type="paragraph">
+  <w:style w:type="paragraph" w:customStyle="1" w:styleId="Figure">
     <w:name w:val="Figure"/>
     <w:basedOn w:val="Normal"/>
   </w:style>
-  <w:style w:customStyle="1" w:styleId="CaptionedFigure" w:type="paragraph">
+  <w:style w:type="paragraph" w:customStyle="1" w:styleId="CaptionedFigure">
     <w:name w:val="Captioned Figure"/>
     <w:basedOn w:val="Figure"/>
     <w:pPr>
       <w:keepNext/>
     </w:pPr>
   </w:style>
-  <w:style w:customStyle="1" w:styleId="BodyTextChar" w:type="character">
+  <w:style w:type="character" w:customStyle="1" w:styleId="BodyTextChar">
     <w:name w:val="Body Text Char"/>
     <w:basedOn w:val="DefaultParagraphFont"/>
     <w:link w:val="BodyText"/>
   </w:style>
-  <w:style w:customStyle="1" w:styleId="VerbatimChar" w:type="character">
+  <w:style w:type="character" w:customStyle="1" w:styleId="VerbatimChar">
     <w:name w:val="Verbatim Char"/>
     <w:basedOn w:val="BodyTextChar"/>
     <w:rPr>
@@ -804,25 +802,25 @@
       <w:sz w:val="22"/>
     </w:rPr>
   </w:style>
-  <w:style w:customStyle="1" w:styleId="SectionNumber" w:type="character">
+  <w:style w:type="character" w:customStyle="1" w:styleId="SectionNumber">
     <w:name w:val="Section Number"/>
     <w:basedOn w:val="BodyTextChar"/>
   </w:style>
-  <w:style w:styleId="FootnoteReference" w:type="character">
+  <w:style w:type="character" w:styleId="FootnoteReference">
     <w:name w:val="Footnote Reference"/>
     <w:basedOn w:val="BodyTextChar"/>
     <w:rPr>
       <w:vertAlign w:val="superscript"/>
     </w:rPr>
   </w:style>
-  <w:style w:styleId="Hyperlink" w:type="character">
+  <w:style w:type="character" w:styleId="Hyperlink">
     <w:name w:val="Hyperlink"/>
     <w:basedOn w:val="BodyTextChar"/>
     <w:rPr>
-      <w:color w:themeColor="accent1" w:val="4F81BD"/>
-    </w:rPr>
-  </w:style>
-  <w:style w:styleId="TOCHeading" w:type="paragraph">
+      <w:color w:val="4F81BD" w:themeColor="accent1"/>
+    </w:rPr>
+  </w:style>
+  <w:style w:type="paragraph" w:styleId="TOCHeading">
     <w:name w:val="TOC Heading"/>
     <w:basedOn w:val="Heading1"/>
     <w:next w:val="BodyText"/>
@@ -834,10 +832,10 @@
       <w:outlineLvl w:val="9"/>
     </w:pPr>
     <w:rPr>
-      <w:rFonts w:asciiTheme="majorHAnsi" w:cstheme="majorBidi" w:eastAsiaTheme="majorEastAsia" w:hAnsiTheme="majorHAnsi"/>
+      <w:rFonts w:asciiTheme="majorHAnsi" w:eastAsiaTheme="majorEastAsia" w:hAnsiTheme="majorHAnsi" w:cstheme="majorBidi"/>
       <w:b w:val="0"/>
       <w:bCs w:val="0"/>
-      <w:color w:themeColor="accent1" w:themeShade="BF" w:val="365F91"/>
+      <w:color w:val="365F91" w:themeColor="accent1" w:themeShade="BF"/>
     </w:rPr>
   </w:style>
   <w:style w:type="paragraph" w:customStyle="1" w:styleId="SourceCode">

</xml_diff>

<commit_message>
Docx writer: First Paragraph After Table style
Word takes the vertical space between blocks from paragraph
spacing, and a table is not a paragraph, so the paragraph after a
table gets no spacing above it: with styles that put no space
before body text, it sits flush against the table's bottom rule.

Following the design proposed in #11901, assign that paragraph a
dedicated style. It is added to the default reference docx with
half a line of space before, based on Body Text. A reference doc
that predates the style gets a bare definition injected, based on
Body Text, so paragraphs after tables keep their body styling.

Like First Paragraph, the boundary mark is consumed by the
paragraph, passes through container blocks to their first
paragraph, and is absorbed by the blocks that reset the paragraph
context.
</commit_message>
<xml_diff>
--- a/test/docx/golden/block_quotes.docx
+++ b/test/docx/golden/block_quotes.docx
@@ -219,6 +219,15 @@
     <w:name w:val="First Paragraph"/>
     <w:basedOn w:val="BodyText"/>
     <w:next w:val="BodyText"/>
+    <w:qFormat/>
+  </w:style>
+  <w:style w:type="paragraph" w:customStyle="1" w:styleId="FirstParagraphAfterTable">
+    <w:name w:val="First Paragraph After Table"/>
+    <w:basedOn w:val="BodyText"/>
+    <w:next w:val="BodyText"/>
+    <w:pPr>
+      <w:spacing w:before="180"/>
+    </w:pPr>
     <w:qFormat/>
   </w:style>
   <w:style w:type="paragraph" w:customStyle="1" w:styleId="Compact">

</xml_diff>